<commit_message>
Thuyết minh chi tiết (từng hiện vật): moscow-metro, tsaritsyno, vdnkh [nhóm B]
Co-Authored-By: Claude Opus 4.8 <noreply@anthropic.com>
Claude-Session: https://claude.ai/code/session_01MZqWNqwwgcn6E8DkqSWatB
</commit_message>
<xml_diff>
--- a/tai-lieu-noi-bo/moscow/moscow-metro.docx
+++ b/tai-lieu-noi-bo/moscow/moscow-metro.docx
@@ -100,6 +100,30 @@
     </w:p>
     <w:p>
       <w:pPr>
+        <w:pStyle w:val="ListBullet"/>
+      </w:pPr>
+      <w:r>
+        <w:t>Komsomolskaya (Vành đai): KTS Alexey Shchusev — người thiết kế Lăng Lenin; 8 bức khảm mạ vàng của Pavel Korin kể ~700 năm chiến công Nga, minh hoạ đúng bài diễn văn 7/11/1941 của Stalin.</w:t>
+      </w:r>
+    </w:p>
+    <w:p>
+      <w:pPr>
+        <w:pStyle w:val="ListBullet"/>
+      </w:pPr>
+      <w:r>
+        <w:t>Novoslobodskaya: 32 ô kính màu do Pavel Korin vẽ, chế tác ở Riga; bức khảm cuối 'Hoà bình thế giới' từng có chân dung Stalin, sau bị gỡ và thay bằng đàn bồ câu trắng.</w:t>
+      </w:r>
+    </w:p>
+    <w:p>
+      <w:pPr>
+        <w:pStyle w:val="ListBullet"/>
+      </w:pPr>
+      <w:r>
+        <w:t>Belorusskaya (Vành đai): sàn ga lát mô phỏng 'tấm thảm/khăn thêu' Belarus (nhà ga hiếm hoi để nhìn xuống chân); 12 bức khảm bát giác cảnh sinh hoạt Belarus.</w:t>
+      </w:r>
+    </w:p>
+    <w:p>
+      <w:pPr>
         <w:pStyle w:val="Heading1"/>
       </w:pPr>
       <w:r>
@@ -670,6 +694,331 @@
       </w:pPr>
       <w:r>
         <w:t>Cuối cùng là câu chuyện của chính những chuyến tàu đầu tiên năm 1935. Người Moskva khi ấy đổ xô đi thử metro như đi hội, ăn mặc trang trọng để 'xuống lòng đất' lần đầu trong đời, nhiều người đi tới đi lui chỉ để ngắm. Gần chín thập kỷ sau, cái cảm giác háo hức pha lẫn ngưỡng mộ ấy vẫn được lặp lại mỗi ngày, lần này trên gương mặt của những du khách phương xa lần đầu bước vào 'cung điện dưới lòng đất' của Moskva.</w:t>
+      </w:r>
+    </w:p>
+    <w:p>
+      <w:pPr>
+        <w:pStyle w:val="Heading1"/>
+      </w:pPr>
+      <w:r>
+        <w:rPr>
+          <w:color w:val="152C4E"/>
+        </w:rPr>
+        <w:t>Cẩm nang theo từng nhà ga — Ga Komsomolskaya (Vành đai): 8 bức khảm 'sử thi quân sự' của Pavel Korin</w:t>
+      </w:r>
+    </w:p>
+    <w:p>
+      <w:pPr>
+        <w:jc w:val="both"/>
+      </w:pPr>
+      <w:r>
+        <w:t>Đây chính là ga tham chiếu của tài liệu, và cũng là 'ngôi sao' đăng quang của cả tuyến Vành đai. Ga khánh thành ngày 30/1/1952, do kiến trúc sư Alexey Shchusev (Алексей Щусев) thiết kế — cũng chính là người đã dựng nên Lăng Lenin trên Quảng trường Đỏ. Một chi tiết đắt để mở lời với khách: người tạo ra ngôi mộ giản dị bằng đá granite đỏ ở trên mặt đất lại là người kiến tạo sảnh ga xa hoa bậc nhất dưới lòng đất. Đại sảnh dài, trần vòm sơn màu vàng kem theo lối Baroque, đỡ bởi 68 cột đá cẩm thạch trắng hình bát giác, và treo những chùm đèn đồ sộ — không gian rộng và cao đến mức nhiều đoàn khách vừa xuống thang cuốn đã phải dừng lại thốt lên.</w:t>
+      </w:r>
+    </w:p>
+    <w:p>
+      <w:pPr>
+        <w:jc w:val="both"/>
+      </w:pPr>
+      <w:r>
+        <w:t>Trên trần là 8 bức tranh khảm mosaic mạ vàng của hoạ sĩ Pavel Korin (Павел Корин), xếp thành một dòng thời gian gần 700 năm chiến công của nước Nga. Lần lượt gồm: Alexander Nevsky (Александр Невский) sau trận Băng Hồ năm 1242; Dmitry Donskoy (Дмитрий Донской) sau trận Kulikovo năm 1380; Kuzma Minin và Dmitry Pozharsky (Минин и Пожарский) chấm dứt 'Thời Loạn' năm 1612; danh tướng Suvorov (Суворов) vượt dãy Alps năm 1799; nguyên soái Kutuzov (Кутузов) ở trận Borodino năm 1812; Lenin đọc diễn văn trên Quảng trường Đỏ; các chiến sĩ Xô-viết cắm cờ trên nóc nhà Quốc hội Đức (Reichstag) ở Berlin năm 1945; và cuối cùng là hình một thiếu nữ tượng trưng cho Tổ quốc Nga đứng trên đống quân kỳ phát-xít bị hạ.</w:t>
+      </w:r>
+    </w:p>
+    <w:p>
+      <w:pPr>
+        <w:jc w:val="both"/>
+      </w:pPr>
+      <w:r>
+        <w:t>Chìa khoá để kể hay ga này là gắn nó với một bài diễn văn. Ngày 7/11/1941, giữa lúc quân Đức áp sát Moskva, lãnh tụ Stalin đứng trên Quảng trường Đỏ kêu gọi binh sĩ hãy noi gương tổ tiên — và ông đọc đúng những cái tên: Nevsky, Donskoy, Minin–Pozharsky, Suvorov, Kutuzov. Mười một năm sau, chính những cái tên ấy được Korin đúc thành vàng son trên đầu hành khách. Vì thế, khi dẫn khách Việt đứng dưới sảnh, hãy chỉ tay lần lượt từng bức theo trình tự thời gian và kể như đang lật một cuốn sử tranh: mỗi tấm khảm là một 'trang' về một lần nước Nga bị dồn đến chân tường rồi vùng dậy.</w:t>
+      </w:r>
+    </w:p>
+    <w:p>
+      <w:pPr>
+        <w:jc w:val="both"/>
+      </w:pPr>
+      <w:r>
+        <w:t>Một lưu ý về tính chính xác để tránh khách thắc mắc: một vài bức khảm ban đầu có hình Stalin; sau thời kỳ phê phán tệ sùng bái cá nhân (từ năm 1956), chúng đã được chỉnh sửa, thay bằng các hình tượng khác. Đây là chi tiết hay để nói về việc nghệ thuật ở metro cũng 'biến động' theo lịch sử chính trị. Cách kể gợi ý: 'Các bạn thử đoán xem trước kia ai từng đứng ở vị trí này' — rồi tiết lộ câu chuyện chỉnh sửa, khách rất thích những 'vết sẹo lịch sử' ẩn trong cái đẹp.</w:t>
+      </w:r>
+    </w:p>
+    <w:p>
+      <w:pPr>
+        <w:jc w:val="both"/>
+      </w:pPr>
+      <w:r>
+        <w:t>Mẹo tham quan tại chỗ: Komsomolskaya luôn đông vì nằm ngay Quảng trường Ba Nhà Ga, nên hãy tách đoàn nép vào một bên sảnh, tránh giữa lối đi. Muốn chụp trọn trần vàng, đứng ở một đầu sảnh chụp dọc theo trục cột sẽ 'ăn' được cả hàng đèn chùm lẫn các bức khảm.</w:t>
+      </w:r>
+    </w:p>
+    <w:p>
+      <w:pPr>
+        <w:pStyle w:val="Heading1"/>
+      </w:pPr>
+      <w:r>
+        <w:rPr>
+          <w:color w:val="152C4E"/>
+        </w:rPr>
+        <w:t>Ga Ploshchad Revolyutsii — 76 pho tượng đồng và tục 'xoa lấy may'</w:t>
+      </w:r>
+    </w:p>
+    <w:p>
+      <w:pPr>
+        <w:jc w:val="both"/>
+      </w:pPr>
+      <w:r>
+        <w:t>Nếu Komsomolskaya khiến người ta ngước lên, thì Ploshchad Revolyutsii (Площадь Революции — 'Quảng trường Cách mạng') buộc người ta cúi nhìn ngang tầm mắt. Ga khánh thành ngày 13/3/1938, sâu 33,6 m, do kiến trúc sư Alexey Dushkin (Алексей Душкин) thiết kế (ông cũng là 'cha đẻ' của Mayakovskaya và Novoslobodskaya sau này). Các vòm cửa ốp đá cẩm thạch đỏ và vàng, trụ ốp đá cẩm thạch đen của Armenia, tạo một khung nền trầm để làm nổi bật thứ khiến nơi đây nổi tiếng: những pho tượng đồng.</w:t>
+      </w:r>
+    </w:p>
+    <w:p>
+      <w:pPr>
+        <w:jc w:val="both"/>
+      </w:pPr>
+      <w:r>
+        <w:t>Toàn ga hiện có 76 pho tượng đồng của nhà điêu khắc Matvey Manizer (Матвей Манизер) — ban đầu là 80 pho. Thực ra chỉ có 20 nhân vật khác nhau, mỗi nhân vật được đúc lặp lại nhiều lần và đặt dưới các vòm cửa dọc sảnh, nên đi hết ga khách sẽ gặp lại 'người quen' vài lần. Đó là một 'điều tra dân số bằng đồng' về xã hội Xô-viết lý tưởng: công nhân du kích, người lính, nông dân, thuỷ thủ cầm súng lục, nữ phi công, người lính biên phòng dắt chó, nữ xạ thủ bắn tỉa, thợ mỏ, kỹ sư, đôi nông dân, đôi sinh viên đang đọc sách, cầu thủ bóng đá, nữ vận động viên, cha mẹ bồng con, và đôi thiếu niên Đội viên.</w:t>
+      </w:r>
+    </w:p>
+    <w:p>
+      <w:pPr>
+        <w:jc w:val="both"/>
+      </w:pPr>
+      <w:r>
+        <w:t>Chi tiết 'ăn khách' nhất là các điểm được xoa bóng loáng vì tục cầu may. Nổi tiếng nhất là mũi chú chó của người lính biên phòng: tương truyền từ khoảng năm 1938, sinh viên trường Bauman gần đó xoa mũi chó trước khi thi để cầu đỗ, dần thành thói quen của cả thành phố. Ngoài ra khách còn xoa khẩu súng lục của người thuỷ thủ, con gà trống trong tay cô gái nông dân, và chiếc giày của cô nữ sinh — mỗi điểm gắn một lời cầu khác nhau (thi cử, tình duyên, may mắn). Đến mức năm 2020, ban quản lý metro từng phải lên tiếng đề nghị hành khách bớt sờ để giữ gìn hiện vật.</w:t>
+      </w:r>
+    </w:p>
+    <w:p>
+      <w:pPr>
+        <w:jc w:val="both"/>
+      </w:pPr>
+      <w:r>
+        <w:t>Có một giai thoại vui rất nên kể (kể như 'chuyện dân gian', không phải sử liệu): vì các vòm cửa khá thấp nên hầu hết pho tượng đều ở tư thế quỳ, ngồi hoặc cúi. Người Moskva xưa bông đùa rằng cả 'nhân dân Xô-viết' trong ga này 'người thì đang ngồi, người thì đang quỳ'. Câu đùa nhẹ nhàng ấy giúp không khí đoàn vui lên, đồng thời cho khách một góc nhìn về đời sống tinh thần thời đó.</w:t>
+      </w:r>
+    </w:p>
+    <w:p>
+      <w:pPr>
+        <w:jc w:val="both"/>
+      </w:pPr>
+      <w:r>
+        <w:t>Cách kể cho đoàn khách Việt: biến nơi đây thành một trò tương tác. Chỉ cho khách 'công thức' — tìm chỗ nào trên tượng sáng bóng nhất thì đó là chỗ được xoa nhiều nhất — rồi để mọi người tự 'truy tìm' chú chó và tự xoa mũi cầu may. Nhắc khách xoa nhẹ nhàng, xếp hàng nhường nhau, và tránh giờ cao điểm vì khu vực chú chó thường có người đứng chờ. Về câu chuyện tượng được sơ tán tránh bom trong chiến tranh rồi phục hồi sau đó, nhiều nguồn có kể nhưng chi tiết năm tháng khác nhau, nên khi thuyết minh hãy nói ở mức 'theo nhiều nguồn kể lại' để giữ độ tin cậy.</w:t>
+      </w:r>
+    </w:p>
+    <w:p>
+      <w:pPr>
+        <w:pStyle w:val="Heading1"/>
+      </w:pPr>
+      <w:r>
+        <w:rPr>
+          <w:color w:val="152C4E"/>
+        </w:rPr>
+        <w:t>Ga Mayakovskaya — Art Deco thép và '24 giờ trên bầu trời Xô-viết' của Deyneka</w:t>
+      </w:r>
+    </w:p>
+    <w:p>
+      <w:pPr>
+        <w:jc w:val="both"/>
+      </w:pPr>
+      <w:r>
+        <w:t>Mayakovskaya (Маяковская) là nhà ga được giới kiến trúc cả thế giới ngả mũ, khánh thành ngày 11/9/1938, đặt theo tên nhà thơ Vladimir Mayakovsky (Владимир Маяковский). Đây là công trình 'ga cột sâu' (deep column station) đầu tiên trên thế giới: thay vì những trụ đặc nặng nề, kiến trúc sư Alexey Dushkin dùng hai hàng cột mảnh ốp thép không gỉ sáng loáng cùng đá bán quý rhodonite (родонит) màu hồng, khiến một không gian nằm sâu 33 m dưới đất lại nhẹ nhõm, thanh thoát như một sảnh khiêu vũ. Chính mô hình ga này đã đoạt Giải thưởng Lớn (Grand Prix) tại Hội chợ Thế giới New York năm 1939.</w:t>
+      </w:r>
+    </w:p>
+    <w:p>
+      <w:pPr>
+        <w:jc w:val="both"/>
+      </w:pPr>
+      <w:r>
+        <w:t>Linh hồn của ga nằm ở trên trần: 34 ô khảm mosaic hình bầu dục (cùng một bức được phát hiện thêm về sau) do hoạ sĩ Alexander Deyneka (Александр Дейнека) sáng tác, mang chủ đề 'Một ngày của đất nước Xô-viết' (Сутки страны Советов) — thường được gọi nôm na là 'bầu trời Xô-viết suốt 24 giờ'. Các bức khảm smalt được thực hiện bởi xưởng của bậc thầy khảm đá Vladimir Frolov (Владимир Фролов) ở Leningrad. Mỗi ô được khoét sâu vào vòm trần, viền đèn hắt sáng, tạo ảo giác như những ô cửa trời mở lên bầu trời: máy bay lượn, vận động viên nhảy, người gieo hạt, cành táo nở hoa, khí cầu, sao đêm... nối nhau thành một ngày–đêm trọn vẹn dù ta đang ở sâu dưới lòng đất.</w:t>
+      </w:r>
+    </w:p>
+    <w:p>
+      <w:pPr>
+        <w:jc w:val="both"/>
+      </w:pPr>
+      <w:r>
+        <w:t>Cách kể độc đáo nhất cho ga này là 'đi bộ xuyên một ngày'. Hãy dẫn khách đi dọc sảnh, vừa đi vừa ngước lên đếm các ô trần: bắt đầu từ bình minh, qua trưa lao động, đến các cảnh thể thao – hàng không giữa ngày, rồi chuyển dần sang trời đêm đầy sao ở cuối sảnh. Nhắc khách rằng người thiết kế cố tình muốn công nhân đi làm ca đêm dưới lòng đất vẫn 'nhìn thấy bầu trời'. Đây là khoảnh khắc khách Việt rất thích cầm điện thoại quay dọc trần.</w:t>
+      </w:r>
+    </w:p>
+    <w:p>
+      <w:pPr>
+        <w:jc w:val="both"/>
+      </w:pPr>
+      <w:r>
+        <w:t>Ga còn là một 'thánh địa' ký ức chiến tranh: đêm 6, rạng sáng 7/11/1941, giữa lúc Moskva bị uy hiếp, lễ mít tinh trọng thể kỷ niệm Cách mạng Tháng Mười đã được tổ chức ngay trong đại sảnh sâu và an toàn này, với bài phát biểu của lãnh tụ; các đại biểu tới dự bằng chính những đoàn tàu đỗ dọc sân ga. Cách kể gợi ý: đứng giữa sảnh, đề nghị khách hình dung hàng ghế xếp kín nơi họ đang đứng và những đoàn tàu biến thành 'phòng gửi áo' — một hình ảnh khiến vẻ đẹp Art Deco bỗng chạm vào lịch sử sống.</w:t>
+      </w:r>
+    </w:p>
+    <w:p>
+      <w:pPr>
+        <w:jc w:val="both"/>
+      </w:pPr>
+      <w:r>
+        <w:t>Mẹo thực hành: trần cao và tối màu nên muốn chụp đẹp các ô khảm, hãy tì máy đứng yên hoặc tựa vào cột để tránh rung; canh lúc tàu vừa rời ga để sảnh vắng, ánh đèn viền trần sẽ nổi bật hơn.</w:t>
+      </w:r>
+    </w:p>
+    <w:p>
+      <w:pPr>
+        <w:pStyle w:val="Heading1"/>
+      </w:pPr>
+      <w:r>
+        <w:rPr>
+          <w:color w:val="152C4E"/>
+        </w:rPr>
+        <w:t>Ga Novoslobodskaya — 32 ô kính màu Riga và bức khảm 'Hoà bình thế giới'</w:t>
+      </w:r>
+    </w:p>
+    <w:p>
+      <w:pPr>
+        <w:jc w:val="both"/>
+      </w:pPr>
+      <w:r>
+        <w:t>Novoslobodskaya (Новослободская) được mệnh danh là 'nhà ga cổ tích', khánh thành ngày 30/1/1952 và là nhà ga cuối cùng mà kiến trúc sư Alexey Dushkin thực hiện. Điểm làm nên tên tuổi của ga là 32 tấm kính màu (vitrage) lồng trong khung đồng, gắn dọc các trụ và được thắp sáng từ bên trong, khiến cả sảnh ngầm rực lên như bên trong một nhà thờ. Các mẫu kính do hoạ sĩ Pavel Korin vẽ phác, rồi được chế tác tại Riga (thủ đô Latvia) bởi các nghệ nhân địa phương. Trong 32 ô, phần lớn là hoa văn hình sao và thực vật, riêng 6 ô có hình người khắc hoạ các nghề trí thức như kiến trúc sư, hoạ sĩ, nhạc công, nhà nông học...</w:t>
+      </w:r>
+    </w:p>
+    <w:p>
+      <w:pPr>
+        <w:jc w:val="both"/>
+      </w:pPr>
+      <w:r>
+        <w:t>Ở cuối sảnh là bức tranh khảm smalt mang tên 'Hoà bình khắp thế gian' (Мир во всём мире), vẽ một người mẹ nâng đứa con trên tay. Ẩn sau bức khảm này là một câu chuyện lịch sử rất 'đắt': ban đầu đứa bé vươn tay về phía một huy hiệu có chân dung Stalin. Dưới thời Khrushchev, chân dung Stalin bị gỡ bỏ; hoạ sĩ phải vẽ lại, và thay vào chỗ đó là những cánh chim bồ câu trắng bay lên. Như vậy, chi tiết đàn bồ câu mà khách nhìn thấy hôm nay chính là 'dấu vết' hữu hình của cả một giai đoạn hạ bệ thần tượng.</w:t>
+      </w:r>
+    </w:p>
+    <w:p>
+      <w:pPr>
+        <w:jc w:val="both"/>
+      </w:pPr>
+      <w:r>
+        <w:t>Cách kể cho khách Việt: đây là ga để 'soi chi tiết'. Trước hết cho khách đứng giữa sảnh cảm nhận hiệu ứng 'nhà thờ ánh sáng', rồi thách đố nhẹ: 'Hãy tìm trong 32 ô kính, 6 ô nào có hình người và họ làm nghề gì?'. Sau đó dẫn tới bức khảm mẹ bồng con ở cuối sảnh và kể câu chuyện Stalin – bồ câu. Sự tương phản giữa vẻ đẹp dịu dàng và biến động chính trị phía sau luôn để lại ấn tượng mạnh.</w:t>
+      </w:r>
+    </w:p>
+    <w:p>
+      <w:pPr>
+        <w:jc w:val="both"/>
+      </w:pPr>
+      <w:r>
+        <w:t>Mẹo thực hành: ánh sáng ấm từ kính màu rất hợp chụp chân dung; đặt khách đứng cạnh một ô kính, lấy ánh sáng hắt ngang mặt sẽ cho khung hình lung linh. Ga nằm gần Komsomolskaya trên tuyến Vành đai nên rất tiện ghép chung một vòng tham quan.</w:t>
+      </w:r>
+    </w:p>
+    <w:p>
+      <w:pPr>
+        <w:pStyle w:val="Heading1"/>
+      </w:pPr>
+      <w:r>
+        <w:rPr>
+          <w:color w:val="152C4E"/>
+        </w:rPr>
+        <w:t>Ga Kiyevskaya (Vành đai) — khúc tụng ca Nga–Ukraine dát vàng</w:t>
+      </w:r>
+    </w:p>
+    <w:p>
+      <w:pPr>
+        <w:jc w:val="both"/>
+      </w:pPr>
+      <w:r>
+        <w:t>Kiyevskaya (Киевская) trên tuyến Vành đai khánh thành ngày 14/3/1954, là nhà ga khép lại toàn tuyến Vành đai và cũng là ga 'đậm chất Ukraine' nhất hệ thống. Mẫu thiết kế do nhóm kiến trúc sư người Ukraine (E. Katonin, V. Skugarev, G. Golubev) thắng cuộc thi tuyển. Sảnh ga lát và ốp đá cẩm thạch trắng, các trụ vuông thấp, trên đó là một loạt tranh khảm viền khung thạch cao mạ vàng lộng lẫy, do hoạ sĩ A. Myzin (А. Мызин) chủ trì.</w:t>
+      </w:r>
+    </w:p>
+    <w:p>
+      <w:pPr>
+        <w:jc w:val="both"/>
+      </w:pPr>
+      <w:r>
+        <w:t>Chủ đề xuyên suốt là tình hữu nghị và sự thống nhất Nga–Ukraine. Ga hoàn thành đúng năm 1954, tròn 300 năm sự kiện Hội nghị Pereyaslav (Переяславская рада) năm 1654 — cột mốc thường được nhắc như khởi đầu của việc sáp nhập vùng đất Ukraine vào nước Nga. Các bức khảm tái hiện những cảnh lịch sử, lao động, lễ hội và văn hoá dân gian Ukraine; ở cuối sảnh là một bức chân dung Lenin bằng khảm. Một bối cảnh thú vị để kể: chính Khrushchev — người từng lãnh đạo Ukraine — là người thúc đẩy công trình, nên ga đôi khi được ví như 'món quà' ông dành cho quê hương thứ hai của mình.</w:t>
+      </w:r>
+    </w:p>
+    <w:p>
+      <w:pPr>
+        <w:jc w:val="both"/>
+      </w:pPr>
+      <w:r>
+        <w:t>Khi thuyết minh cho khách Việt, nên giữ giọng trung tính, mô tả đây là một tác phẩm nghệ thuật – tuyên truyền tiêu biểu cho tư tưởng 'tình hữu nghị các dân tộc' thời Xô-viết, thay vì bình luận về thời sự hôm nay. Cách kể gợi ý: đối lập 'chất vàng son cung đình' của Kiyevskaya với 'chất thép hiện đại' của Mayakovskaya để khách thấy sự đa dạng phong cách chỉ trong một hệ thống. Hãy để khách thong thả đi từng vòm, mỗi vòm là một bức khảm như một 'bức tranh treo tường' có khung vàng.</w:t>
+      </w:r>
+    </w:p>
+    <w:p>
+      <w:pPr>
+        <w:jc w:val="both"/>
+      </w:pPr>
+      <w:r>
+        <w:t>Mẹo thực hành: khung vàng và nền sáng của Kiyevskaya rất 'lên hình'; canh chụp một dãy vòm liên tiếp để thấy nhịp lặp của các khung tranh. Ga là đầu mối lớn nối ga đường sắt Kiyevsky và trung tâm thương mại Evropeisky, tiện cho khách kết hợp nghỉ chân, mua sắm.</w:t>
+      </w:r>
+    </w:p>
+    <w:p>
+      <w:pPr>
+        <w:pStyle w:val="Heading1"/>
+      </w:pPr>
+      <w:r>
+        <w:rPr>
+          <w:color w:val="152C4E"/>
+        </w:rPr>
+        <w:t>Ga Belorusskaya (Vành đai) — 'tấm thảm' dưới chân và 12 bức khảm Belarus</w:t>
+      </w:r>
+    </w:p>
+    <w:p>
+      <w:pPr>
+        <w:jc w:val="both"/>
+      </w:pPr>
+      <w:r>
+        <w:t>Belorusskaya (Белорусская) trên tuyến Vành đai khánh thành ngày 30/1/1952, tôn vinh nước cộng hoà Belarus anh em. Đây là nhà ga hiếm hoi mà điều đặc sắc nhất lại nằm... dưới chân khách: toàn bộ sàn sảnh được lát ghép mô phỏng một tấm thảm/khăn thêu truyền thống của Belarus, với hoa văn hình học đối xứng như một 'tấm dệt' trải dài. Vì thế, trong khi hầu hết các ga khác bắt khách ngước lên, thì ở Belorusskaya hãy nhắc khách nhìn xuống để không giẫm 'hụt' mất kiệt tác.</w:t>
+      </w:r>
+    </w:p>
+    <w:p>
+      <w:pPr>
+        <w:jc w:val="both"/>
+      </w:pPr>
+      <w:r>
+        <w:t>Trên trần là 12 bức khảm hình bát giác của các hoạ sĩ G. Opryshko, S. Volkov và I. Morozov, khắc hoạ đời sống và lao động của người dân Belarus: mùa gặt, dệt vải, nghề thủ công, sinh hoạt làng quê... Các trụ ốp đá cẩm thạch trắng thấp, trần vữa đắp hoa văn tinh xảo. Trước đây ở cuối sảnh còn có cụm tượng 'Belarus Xô-viết' (Советская Белоруссия) của nhà điêu khắc Matvey Manizer — cùng tác giả với các pho tượng ở Ploshchad Revolyutsii — nhưng cụm tượng đã bị tháo dỡ năm 1998 để mở thêm một lối ra.</w:t>
+      </w:r>
+    </w:p>
+    <w:p>
+      <w:pPr>
+        <w:jc w:val="both"/>
+      </w:pPr>
+      <w:r>
+        <w:t>Cách kể cho khách Việt: dùng Belorusskaya làm 'nốt lặng' đổi nhịp trong hành trình. Sau nhiều ga phải ngẩng đầu, hãy nói vui: 'Ga này mời cả đoàn nhìn xuống chân một chút' — rồi giải thích ý tưởng biến sàn nhà ga thành một tấm thảm dân tộc, như thể trải chiếu hoa đón khách. Liên hệ với văn hoá Việt (chiếu hoa, thổ cẩm) sẽ giúp khách dễ đồng cảm. Nhắc khách bước nhẹ và tránh kéo vali lê trên phần hoa văn.</w:t>
+      </w:r>
+    </w:p>
+    <w:p>
+      <w:pPr>
+        <w:jc w:val="both"/>
+      </w:pPr>
+      <w:r>
+        <w:t>Mẹo thực hành: muốn chụp trọn 'tấm thảm', đứng sát tường một bên sảnh, hạ máy thấp và chụp chếch xuống theo trục sàn. Belorusskaya nằm ngay cạnh ga đường sắt Belorussky (nơi đón tàu đi sân bay Sheremetyevo bằng Aeroexpress), rất tiện cho khách sắp ra sân bay ghé xem trước khi rời Moskva.</w:t>
+      </w:r>
+    </w:p>
+    <w:p>
+      <w:pPr>
+        <w:pStyle w:val="Heading1"/>
+      </w:pPr>
+      <w:r>
+        <w:rPr>
+          <w:color w:val="152C4E"/>
+        </w:rPr>
+        <w:t>Gợi ý lộ trình 90 phút &amp; cách kể cho đoàn khách Việt</w:t>
+      </w:r>
+    </w:p>
+    <w:p>
+      <w:pPr>
+        <w:jc w:val="both"/>
+      </w:pPr>
+      <w:r>
+        <w:t>Một vòng tham quan gọn cho đoàn khách Việt có thể bắt đầu ngay tại ga tham chiếu Komsomolskaya, đi trọn một chiều tuyến Vành đai (màu nâu) và dừng ở các 'cung điện' đẹp nhất: Komsomolskaya → Novoslobodskaya → Belorusskaya → Kiyevskaya, rồi từ tuyến Vành đai chuyển sang khu trung tâm để xem hai 'đỉnh cao' Mayakovskaya và Ploshchad Revolyutsii. Toàn bộ chỉ tốn đúng một lượt quẹt thẻ Troika miễn là không ra khỏi cửa soát, và gói gọn trong khoảng 90 phút nếu mỗi ga dừng 10–15 phút.</w:t>
+      </w:r>
+    </w:p>
+    <w:p>
+      <w:pPr>
+        <w:jc w:val="both"/>
+      </w:pPr>
+      <w:r>
+        <w:t>Bí quyết dẫn đoàn dưới lòng đất: luôn hẹn 'điểm tập kết' ở đầu mỗi sảnh trước khi cho khách tản ra chụp ảnh, vì sóng điện thoại dưới ga chập chờn và biển chỉ dẫn hầu hết bằng chữ Kirin. Đếm đủ số khách trước khi lên tàu; dặn khách nhớ màu và số tuyến (Vành đai là màu nâu, số 5) thay vì nhớ tên ga khó đọc. Chọn khung giữa buổi sáng hoặc đầu chiều ngày thường để tránh biển người giờ cao điểm.</w:t>
+      </w:r>
+    </w:p>
+    <w:p>
+      <w:pPr>
+        <w:jc w:val="both"/>
+      </w:pPr>
+      <w:r>
+        <w:t>Gợi ý 'câu mở' cho mỗi ga để khách dễ nhớ: Komsomolskaya — 'nhà ga của tướng lĩnh và chiến thắng'; Novoslobodskaya — 'nhà thờ ánh sáng dưới lòng đất'; Belorusskaya — 'nhà ga mời bạn nhìn xuống chân'; Kiyevskaya — 'phòng tranh khung vàng'; Mayakovskaya — 'đi bộ xuyên một ngày trên bầu trời'; Ploshchad Revolyutsii — 'xoa mũi chó cầu may'. Mỗi câu ngắn ấy vừa là 'nhãn' giúp khách phân biệt các ga, vừa mở đường cho câu chuyện chi tiết phía sau.</w:t>
+      </w:r>
+    </w:p>
+    <w:p>
+      <w:pPr>
+        <w:jc w:val="both"/>
+      </w:pPr>
+      <w:r>
+        <w:t>Cuối cùng, hãy chốt trải nghiệm bằng một thông điệp lớn: metro Moskva ra đời với khẩu hiệu 'cung điện cho nhân dân' — cái đẹp vốn dành cho vua chúa nay được đặt ngay dưới bước chân người lao động thường ngày. Khi khách Việt hiểu điều đó, mỗi bức khảm, mỗi pho tượng, mỗi ô kính không còn là đồ trang trí, mà là một tuyên ngôn về việc ai xứng đáng được sống giữa cái đẹp. Đó là 'sợi chỉ đỏ' để buộc cả buổi tham quan thành một câu chuyện trọn vẹn.</w:t>
       </w:r>
     </w:p>
     <w:p>
@@ -905,6 +1254,51 @@
       </w:r>
     </w:p>
     <w:p>
+      <w:r>
+        <w:rPr>
+          <w:sz w:val="22"/>
+        </w:rPr>
+        <w:t xml:space="preserve">• Wikipedia (EN) — Novoslobodskaya (Moscow Metro) — </w:t>
+      </w:r>
+      <w:r>
+        <w:rPr>
+          <w:color w:val="204A86"/>
+          <w:sz w:val="20"/>
+        </w:rPr>
+        <w:t>https://en.wikipedia.org/wiki/Novoslobodskaya_(Moscow_Metro)</w:t>
+      </w:r>
+    </w:p>
+    <w:p>
+      <w:r>
+        <w:rPr>
+          <w:sz w:val="22"/>
+        </w:rPr>
+        <w:t xml:space="preserve">• Wikipedia (EN) — Kiyevskaya (Koltsevaya line) — </w:t>
+      </w:r>
+      <w:r>
+        <w:rPr>
+          <w:color w:val="204A86"/>
+          <w:sz w:val="20"/>
+        </w:rPr>
+        <w:t>https://en.wikipedia.org/wiki/Kiyevskaya_(Koltsevaya_line)</w:t>
+      </w:r>
+    </w:p>
+    <w:p>
+      <w:r>
+        <w:rPr>
+          <w:sz w:val="22"/>
+        </w:rPr>
+        <w:t xml:space="preserve">• Wikipedia (EN) — Belorusskaya (Koltsevaya line) — </w:t>
+      </w:r>
+      <w:r>
+        <w:rPr>
+          <w:color w:val="204A86"/>
+          <w:sz w:val="20"/>
+        </w:rPr>
+        <w:t>https://en.wikipedia.org/wiki/Belorusskaya_(Koltsevaya_line)</w:t>
+      </w:r>
+    </w:p>
+    <w:p>
       <w:pPr>
         <w:pStyle w:val="Heading2"/>
       </w:pPr>
@@ -972,11 +1366,38 @@
     <w:p>
       <w:r>
         <w:rPr>
+          <w:color w:val="5C6773"/>
+          <w:sz w:val="20"/>
+        </w:rPr>
+        <w:t>Wikipedia tiếng Anh — các bài về từng nhà ga: 'Komsomolskaya (Koltsevaya line)' (khánh thành 30/1/1952, KTS Shchusev, 8 khảm của Pavel Korin, 68 cột, chủ đề tướng lĩnh Nga, liên hệ diễn văn 7/11/1941); 'Ploshchad Revolyutsii (Moscow Metro)' (13/3/1938, KTS Dushkin, sâu 33,6 m, 76 tượng — gốc 80 — của Manizer, 10 cặp × 4 bản, các điểm xoa lấy may: súng lục, chó, gà trống, giày nữ sinh); 'Mayakovskaya (Moscow Metro)' (11/9/1938, ga cột sâu đầu tiên, thép không gỉ + rhodonite, 34 khảm của Deyneka 'Сутки страны Советов', Grand Prix New York 1939, mít tinh 6–7/11/1941).</w:t>
+      </w:r>
+    </w:p>
+    <w:p>
+      <w:r>
+        <w:rPr>
+          <w:color w:val="5C6773"/>
+          <w:sz w:val="20"/>
+        </w:rPr>
+        <w:t>Wikipedia tiếng Anh — 'Novoslobodskaya (Moscow Metro)' (30/1/1952, 32 ô kính màu vẽ bởi Korin làm ở Riga, khảm cuối 'Мир во всём мире' mẹ bồng con, medallion Stalin bị gỡ thời Khrushchev thay bằng bồ câu); 'Kiyevskaya (Koltsevaya line)' (14/3/1954, nhóm KTS Katonin–Skugarev–Golubev, khảm của A. Myzin chủ đề hữu nghị Nga–Ukraine, chân dung Lenin cuối sảnh, đá cẩm thạch trắng); 'Belorusskaya (Koltsevaya line)' (30/1/1952, 12 khảm bát giác của Opryshko–Volkov–Morozov về đời sống Belarus, sàn lát mô phỏng thảm Belarus, cụm tượng 'Советская Белоруссия' của Manizer tháo năm 1998).</w:t>
+      </w:r>
+    </w:p>
+    <w:p>
+      <w:r>
+        <w:rPr>
+          <w:color w:val="5C6773"/>
+          <w:sz w:val="20"/>
+        </w:rPr>
+        <w:t>The Moscow Times (2020) — ban quản lý metro kêu gọi hành khách ngừng xoa các pho tượng ở Ploshchad Revolyutsii để bảo tồn: xác nhận tục xoa lấy may và các điểm bị mòn bóng.</w:t>
+      </w:r>
+    </w:p>
+    <w:p>
+      <w:r>
+        <w:rPr>
           <w:i/>
           <w:color w:val="5C6773"/>
           <w:sz w:val="18"/>
         </w:rPr>
-        <w:t>Tài liệu nội bộ — không dùng cho mục đích public. Biên soạn nguyên gốc, có dẫn nguồn. Cập nhật 2026-08-11.</w:t>
+        <w:t>Tài liệu nội bộ — không dùng cho mục đích public. Biên soạn nguyên gốc, có dẫn nguồn. Cập nhật 2026-09-27.</w:t>
       </w:r>
     </w:p>
     <w:sectPr>

</xml_diff>